<commit_message>
Rewrite Word storyboard from actual video VTT scripts
- Voice over column now pulls exact text from the 7 module videos.\n- Production notes and OST now match the SCORM components and assets.
</commit_message>
<xml_diff>
--- a/SolarPV_Unit2_Storyboard.docx
+++ b/SolarPV_Unit2_Storyboard.docx
@@ -12,7 +12,7 @@
           <w:color w:val="0A1626"/>
           <w:sz w:val="36"/>
         </w:rPr>
-        <w:t>Solar PV Unit 2 — Storyboard &amp; Client Delivery Pack</w:t>
+        <w:t>Solar PV Unit 2 — Storyboard</w:t>
       </w:r>
     </w:p>
     <w:p>
@@ -24,7 +24,7 @@
           <w:color w:val="7D95B0"/>
           <w:sz w:val="22"/>
         </w:rPr>
-        <w:t>SCORM 1.2 · Adapt Framework 5.56.2 · Mobile-first</w:t>
+        <w:t>Adapt Framework 5.56.2 · SCORM 1.2 · ~10–12 min</w:t>
       </w:r>
     </w:p>
     <w:p/>
@@ -33,30 +33,10 @@
         <w:rPr>
           <w:b/>
         </w:rPr>
-        <w:t xml:space="preserve">Duration: </w:t>
-      </w:r>
-      <w:r>
-        <w:t>10–12 minutes</w:t>
-      </w:r>
-      <w:r>
-        <w:rPr>
-          <w:b/>
-        </w:rPr>
-        <w:br/>
-        <w:t xml:space="preserve">Target Audience: </w:t>
-      </w:r>
-      <w:r>
-        <w:t>Field technicians, sales teams, vocational learners</w:t>
-      </w:r>
-      <w:r>
-        <w:rPr>
-          <w:b/>
-        </w:rPr>
-        <w:br/>
         <w:t xml:space="preserve">Client Need: </w:t>
       </w:r>
       <w:r>
-        <w:t>Replace static product decks with a trackable, device-friendly learning unit that teaches how to read a solar panel datasheet, differentiate panel types, and explain module construction.</w:t>
+        <w:t>Field technicians and sales teams must identify solar panel parts, read datasheets, differentiate the three PV technologies, and confidently recommend the right panel for a site. This module turns the existing short-form video scripts into a trackable, mobile-first SCORM unit with interactive reinforcement and AR visualisation.</w:t>
       </w:r>
     </w:p>
     <w:p/>
@@ -208,7 +188,7 @@
           </w:tcPr>
           <w:p>
             <w:r>
-              <w:t>Narrator</w:t>
+              <w:t>Narrator / Installer</w:t>
             </w:r>
           </w:p>
         </w:tc>
@@ -248,7 +228,7 @@
           </w:tcPr>
           <w:p>
             <w:r>
-              <w:t>Smart casual – navy polo, ID badge</w:t>
+              <w:t>Smart casual navy polo, ID badge</w:t>
             </w:r>
           </w:p>
         </w:tc>
@@ -258,7 +238,7 @@
           </w:tcPr>
           <w:p>
             <w:r>
-              <w:t>Warm, confident energy; guides learners through each scene; medium build; clean-shaven; short black hair.</w:t>
+              <w:t>Confident, friendly guide who frames each scene and asks the learner to apply knowledge.</w:t>
             </w:r>
           </w:p>
         </w:tc>
@@ -338,7 +318,7 @@
           </w:tcPr>
           <w:p>
             <w:r>
-              <w:t>Practical and clear; demonstrates rooftop inspection and panel handling; tied-back hair; safety glasses.</w:t>
+              <w:t>Hands-on expert who points out real parts and explains specifications on site.</w:t>
             </w:r>
           </w:p>
         </w:tc>
@@ -368,7 +348,7 @@
           </w:tcPr>
           <w:p>
             <w:r>
-              <w:t>Customer / Homeowner</w:t>
+              <w:t>Homeowner / Customer</w:t>
             </w:r>
           </w:p>
         </w:tc>
@@ -418,7 +398,7 @@
           </w:tcPr>
           <w:p>
             <w:r>
-              <w:t>Asks the business questions that the learner must answer; salt-and-pepper hair; patient expression.</w:t>
+              <w:t>Represents the end-customer question: which panel, why, and how much space?</w:t>
             </w:r>
           </w:p>
         </w:tc>
@@ -488,7 +468,7 @@
           </w:tcPr>
           <w:p>
             <w:r>
-              <w:t>Lab coat, gloves, clipboard</w:t>
+              <w:t>Lab coat, gloves</w:t>
             </w:r>
           </w:p>
         </w:tc>
@@ -498,7 +478,7 @@
           </w:tcPr>
           <w:p>
             <w:r>
-              <w:t>Walks through cell-to-module construction and P-N junction simulation; curious, precise.</w:t>
+              <w:t>Explains cell-to-module construction and P-N junction physics.</w:t>
             </w:r>
           </w:p>
         </w:tc>
@@ -528,7 +508,7 @@
           </w:tcPr>
           <w:p>
             <w:r>
-              <w:t>3D / AR Panel</w:t>
+              <w:t>3D Asset</w:t>
             </w:r>
           </w:p>
         </w:tc>
@@ -568,7 +548,7 @@
           </w:tcPr>
           <w:p>
             <w:r>
-              <w:t>Black mono-PERC cells, silver aluminium frame, junction box</w:t>
+              <w:t>Black mono cells, silver frame, junction box</w:t>
             </w:r>
           </w:p>
         </w:tc>
@@ -578,7 +558,7 @@
           </w:tcPr>
           <w:p>
             <w:r>
-              <w:t>1.002 m × 1.690 m portrait panel with visible cells, busbars, and silver frame. Used in 3D lab, diagrams, and AR.</w:t>
+              <w:t>1.002 m × 1.690 m portrait PV module. Appears in 3D lab, diagrams, and AR.</w:t>
             </w:r>
           </w:p>
         </w:tc>
@@ -595,6 +575,15 @@
       </w:tr>
     </w:tbl>
     <w:p/>
+    <w:p>
+      <w:r>
+        <w:rPr>
+          <w:b/>
+          <w:sz w:val="28"/>
+        </w:rPr>
+        <w:t>Scene / Frame Table</w:t>
+      </w:r>
+    </w:p>
     <w:tbl>
       <w:tblPr>
         <w:tblStyle w:val="TableGrid"/>
@@ -672,7 +661,7 @@
               <w:br/>
               <w:t>Welcome</w:t>
               <w:br/>
-              <w:t>~1:40</w:t>
+              <w:t>1:40</w:t>
             </w:r>
           </w:p>
         </w:tc>
@@ -682,7 +671,9 @@
           </w:tcPr>
           <w:p>
             <w:r>
-              <w:t>Arjun: Welcome to Solar PV Unit 2. In the next few minutes you will learn how to choose the right panel, read a datasheet, and visualise a panel on a real rooftop.</w:t>
+              <w:t>Narrator (Arjun):</w:t>
+              <w:br/>
+              <w:t>Welcome to this module on choosing the right solar panel. You'll learn to identify the parts of a module, read its specifications, tell the three panel types apart, and recommend the right panel for a site.</w:t>
             </w:r>
           </w:p>
         </w:tc>
@@ -692,7 +683,7 @@
           </w:tcPr>
           <w:p>
             <w:r>
-              <w:t>Full-screen cinematic header. Deep navy background, amber sun, silhouette figures on a rooftop. Simulated output widget animates in the top right. Gold corner brackets frame the scene. First-frame thumbnail used for the video poster.</w:t>
+              <w:t>Course menu tile shows dusk rooftop wallpaper, first-frame video thumbnail, and a blue "Begin module" CTA. Header uses client palette: deep navy, amber sun, panel silhouettes, gold corner brackets. Animated simulated-output widget in the header.</w:t>
             </w:r>
           </w:p>
         </w:tc>
@@ -704,7 +695,7 @@
             <w:r>
               <w:t>Title: Choosing the Right Solar Panel</w:t>
               <w:br/>
-              <w:t>Sub-title: Solar PV Unit 2</w:t>
+              <w:t>Subtitle: Solar PV Unit 2 — ~12 min</w:t>
               <w:br/>
               <w:t>CTA: Begin module</w:t>
             </w:r>
@@ -722,7 +713,7 @@
               <w:br/>
               <w:t>From a Cell to a Module</w:t>
               <w:br/>
-              <w:t>~2:10</w:t>
+              <w:t>2:10</w:t>
             </w:r>
           </w:p>
         </w:tc>
@@ -732,7 +723,9 @@
           </w:tcPr>
           <w:p>
             <w:r>
-              <w:t>Divya: Electricity starts in one solar cell. Wire many cells together, seal them with glass, EVA, and a back-sheet, and you get a module.</w:t>
+              <w:t>Divya (Lab Technician):</w:t>
+              <w:br/>
+              <w:t>A single cell makes only about half a volt. Wire many cells together and seal them, and you get a module. Connect modules together and you get an array.</w:t>
             </w:r>
           </w:p>
         </w:tc>
@@ -742,7 +735,7 @@
           </w:tcPr>
           <w:p>
             <w:r>
-              <w:t>Video plays top half. Below it, embedded interactive panel shows cell-to-module zoom with clickable hotspots. Learner can launch the P-N junction simulation full-screen. Voice over matches captions.</w:t>
+              <w:t>Media component plays the video with burned-in captions. Below the video, a solar-embed interactive shows the cell-to-module zoom with hotspots. A second embedded interactive (P-N junction simulation) lets the learner fire a photon and watch charge separation. Both launch full-screen.</w:t>
             </w:r>
           </w:p>
         </w:tc>
@@ -752,9 +745,11 @@
           </w:tcPr>
           <w:p>
             <w:r>
-              <w:t>On-screen labels: Cell, Busbar, Encapsulant, Glass, Frame</w:t>
+              <w:t>Labels: Cell, Busbar, EVA, Glass, Backsheet, Frame</w:t>
               <w:br/>
-              <w:t>Interactive CTA: Launch full-screen simulation</w:t>
+              <w:t>CTA 1: Launch P-N junction simulation</w:t>
+              <w:br/>
+              <w:t>CTA 2: Launch full-screen cell diagram</w:t>
             </w:r>
           </w:p>
         </w:tc>
@@ -770,7 +765,7 @@
               <w:br/>
               <w:t>Inside the Module</w:t>
               <w:br/>
-              <w:t>~2:00</w:t>
+              <w:t>2:00</w:t>
             </w:r>
           </w:p>
         </w:tc>
@@ -780,7 +775,9 @@
           </w:tcPr>
           <w:p>
             <w:r>
-              <w:t>Meera: A PV module is a sealed sandwich built to survive 25 years outdoors. Let us look at each layer and why it matters.</w:t>
+              <w:t>Meera (Site Engineer):</w:t>
+              <w:br/>
+              <w:t>A module is a sealed sandwich built to last 25 years. Tempered glass on top, cells sealed between two layers of EVA, a weatherproof back-sheet, an aluminium frame, and a junction box.</w:t>
             </w:r>
           </w:p>
         </w:tc>
@@ -790,7 +787,7 @@
           </w:tcPr>
           <w:p>
             <w:r>
-              <w:t>3D virtual lab embedded: rotate the panel, explode layers, switch technology. Followed by system energy flow diagram with day/night toggle. SVG wires use pointer-events:none so clicks pass to click targets.</w:t>
+              <w:t>Video with first-frame thumbnail. Followed by 3D virtual lab embed: rotate panel, explode layers, switch Mono/Poly/Thin-film, adjust sun and temperature. Then the system energy flow diagram with day/night toggle and clickable rooftop components.</w:t>
             </w:r>
           </w:p>
         </w:tc>
@@ -800,9 +797,9 @@
           </w:tcPr>
           <w:p>
             <w:r>
-              <w:t>Layers: Tempered glass → EVA → Cells → EVA → Backsheet → Frame → Junction box</w:t>
+              <w:t>3D Lab labels: Tempered glass, EVA, Cells, Backsheet, Frame, Junction box</w:t>
               <w:br/>
-              <w:t>Diagram CTA: Click each part to learn its role</w:t>
+              <w:t>Diagram labels: Panels, Inverter, Battery, Loads, Grid</w:t>
             </w:r>
           </w:p>
         </w:tc>
@@ -818,7 +815,7 @@
               <w:br/>
               <w:t>The Three Technologies</w:t>
               <w:br/>
-              <w:t>~1:50</w:t>
+              <w:t>1:50</w:t>
             </w:r>
           </w:p>
         </w:tc>
@@ -828,7 +825,9 @@
           </w:tcPr>
           <w:p>
             <w:r>
-              <w:t>Arjun: There are three families of panel. Each has a different look, efficiency, and best use.</w:t>
+              <w:t>Narrator (Arjun):</w:t>
+              <w:br/>
+              <w:t>Monocrystalline is black and the most efficient. Polycrystalline is blue and easier on the budget. Thin-film is flexible and the calmest in high heat. The site decides the choice.</w:t>
             </w:r>
           </w:p>
         </w:tc>
@@ -838,7 +837,7 @@
           </w:tcPr>
           <w:p>
             <w:r>
-              <w:t>Narrative swipe cards compare monocrystalline, polycrystalline, and thin-film. Embedded 3D lab panel technology switcher updates the model texture in real time.</w:t>
+              <w:t>Media component with video. Followed by a Narrative component with three swipe cards (Mono / Poly / Thin-film), each showing look, efficiency, and best use. The 3D lab technology switcher updates the panel texture to match the selected card.</w:t>
             </w:r>
           </w:p>
         </w:tc>
@@ -848,9 +847,11 @@
           </w:tcPr>
           <w:p>
             <w:r>
-              <w:t>Cards: Monocrystalline · Polycrystalline · Thin-film</w:t>
+              <w:t>Card 1: Monocrystalline — black, highest efficiency, limited space</w:t>
               <w:br/>
-              <w:t>Key takeaway: Highest efficiency per m² = Monocrystalline</w:t>
+              <w:t>Card 2: Polycrystalline — blue, budget-friendly, space available</w:t>
+              <w:br/>
+              <w:t>Card 3: Thin-film — flexible, best in high heat</w:t>
             </w:r>
           </w:p>
         </w:tc>
@@ -866,7 +867,7 @@
               <w:br/>
               <w:t>Reading Specifications</w:t>
               <w:br/>
-              <w:t>~1:40</w:t>
+              <w:t>1:40</w:t>
             </w:r>
           </w:p>
         </w:tc>
@@ -876,7 +877,9 @@
           </w:tcPr>
           <w:p>
             <w:r>
-              <w:t>Meera: Every panel carries a datasheet. The key numbers tell you how it behaves once wired into the system.</w:t>
+              <w:t>Meera (Site Engineer):</w:t>
+              <w:br/>
+              <w:t>Watt-peak is measured at standard test conditions. Voc is the open-circuit voltage, Isc the short-circuit current, and the temperature coefficient shows how much power is lost as the panel heats up.</w:t>
             </w:r>
           </w:p>
         </w:tc>
@@ -886,7 +889,7 @@
           </w:tcPr>
           <w:p>
             <w:r>
-              <w:t>Panel parts + specification card interactive. Hotspots identify glass, cells, busbars, junction box, frame. Spec card shows Pmax, Voc, Isc, Vmp, Imp, efficiency, temperature coefficient.</w:t>
+              <w:t>Media component with video. Below it, the panel labels + spec card interactive: hotspots on the panel image identify each physical part; the spec card shows SolarMax-400W values and a short definition of each term.</w:t>
             </w:r>
           </w:p>
         </w:tc>
@@ -896,9 +899,19 @@
           </w:tcPr>
           <w:p>
             <w:r>
-              <w:t>Spec card: SolarMax-400W</w:t>
+              <w:t>Spec card:</w:t>
               <w:br/>
-              <w:t>Pmax 400 Wp · Voc 49.8 V · Isc 10.25 A · Vmp 41.6 V · Imp 9.62 A · Efficiency 20.4%</w:t>
+              <w:t>Pmax 400 Wp</w:t>
+              <w:br/>
+              <w:t>Voc 49.8 V</w:t>
+              <w:br/>
+              <w:t>Isc 10.25 A</w:t>
+              <w:br/>
+              <w:t>Vmp 41.6 V</w:t>
+              <w:br/>
+              <w:t>Imp 9.62 A</w:t>
+              <w:br/>
+              <w:t>Temp coeff -0.35 %/°C</w:t>
             </w:r>
           </w:p>
         </w:tc>
@@ -912,9 +925,9 @@
             <w:r>
               <w:t>Scene 6</w:t>
               <w:br/>
-              <w:t>AR Experience</w:t>
+              <w:t>3D Virtual Lab &amp; AR</w:t>
               <w:br/>
-              <w:t>~2:00</w:t>
+              <w:t>2:00</w:t>
             </w:r>
           </w:p>
         </w:tc>
@@ -924,7 +937,9 @@
           </w:tcPr>
           <w:p>
             <w:r>
-              <w:t>Arjun: Now place a full-size panel in your own space. Tap Launch AR, point your phone at the floor, and the panel appears life-size.</w:t>
+              <w:t>Narrator (Arjun):</w:t>
+              <w:br/>
+              <w:t>In the 3D lab you can rotate the module, explode its layers, switch between the three technologies, and change the sunlight and temperature to watch the live power output respond.</w:t>
             </w:r>
           </w:p>
         </w:tc>
@@ -934,7 +949,7 @@
           </w:tcPr>
           <w:p>
             <w:r>
-              <w:t>Embedded solar-embed component launches course/en/ar.html. model-viewer loads panel.glb with ios-src=panel.usdz for iPhone Quick Look. Launch AR button calls viewer.activateAR(). Desktop users see a 3D preview and a QR code to open on their phone.</w:t>
+              <w:t>Embedded 3D virtual lab (three.js) and the AR experience (model-viewer). model-viewer loads panel.glb with ios-src=panel.usdz for iOS Quick Look. The Launch AR button calls viewer.activateAR(). Desktop fallback shows QR code to open on a phone.</w:t>
             </w:r>
           </w:p>
         </w:tc>
@@ -944,11 +959,11 @@
           </w:tcPr>
           <w:p>
             <w:r>
-              <w:t>Button: Launch AR full-screen</w:t>
+              <w:t>Buttons: Launch full-screen lab · Launch AR full-screen</w:t>
               <w:br/>
               <w:t>Tip: Move your phone slowly and point at an open floor</w:t>
               <w:br/>
-              <w:t>Fallback: QR code to open on your phone</w:t>
+              <w:t>AR: View in AR / Auto-track AR / Manual AR</w:t>
             </w:r>
           </w:p>
         </w:tc>
@@ -962,9 +977,9 @@
             <w:r>
               <w:t>Scene 7</w:t>
               <w:br/>
-              <w:t>Knowledge Check</w:t>
+              <w:t>Summary &amp; Assessment</w:t>
               <w:br/>
-              <w:t>~1:00</w:t>
+              <w:t>1:00</w:t>
             </w:r>
           </w:p>
         </w:tc>
@@ -974,7 +989,9 @@
           </w:tcPr>
           <w:p>
             <w:r>
-              <w:t>Arjun: Let us check what you remember. Three quick questions.</w:t>
+              <w:t>Narrator (Arjun):</w:t>
+              <w:br/>
+              <w:t>You can now name the layers of a solar module, read its key specifications, tell the three technologies apart, and choose the right panel for a site. That's the installer's craft.</w:t>
             </w:r>
           </w:p>
         </w:tc>
@@ -984,7 +1001,7 @@
           </w:tcPr>
           <w:p>
             <w:r>
-              <w:t>Q1 MCQ: Which layer faces the sun? Q2 MCQ: Which technology produces the most power per square metre? Q3 Matching: Pmax / Voc / Isc meanings. SCORM 1.2 records raw score and lesson_status.</w:t>
+              <w:t>Summary video, followed by three assessment components: Q1 MCQ (which layer faces the sun), Q2 MCQ (most power per m²), Q3 matching (Pmax / Voc / Isc). SCORM 1.2 records raw score, interactions, and sets lesson_status to completed on pass.</w:t>
             </w:r>
           </w:p>
         </w:tc>
@@ -1030,7 +1047,7 @@
           </w:tcPr>
           <w:p>
             <w:r>
-              <w:t>Package built with NODE_OPTIONS=--experimental-global-webcrypto npx grunt build --disable-cache. Zip contains imsmanifest.xml, index_lms.html, SCORM_API_wrapper.js, all assets, and the fixed AR page.</w:t>
+              <w:t>Build command: NODE_OPTIONS=--experimental-global-webcrypto npx grunt build --disable-cache. Package includes imsmanifest.xml pointing to index_lms.html, pipwerks SCORM API wrapper, all videos, interactives, 3D assets, and the fixed AR page.</w:t>
             </w:r>
           </w:p>
         </w:tc>
@@ -1040,21 +1057,16 @@
           </w:tcPr>
           <w:p>
             <w:r>
-              <w:t>Files:</w:t>
+              <w:t>Solar_PV_Adapt_SCORM12.zip</w:t>
               <w:br/>
-              <w:t>Solar_PV_Adapt_SCORM12.zip (SCORM 1.2)</w:t>
+              <w:t>Live preview: https://nikhilsaini-iitj.github.io/Solar_PV_Adapt_SCORM12/</w:t>
               <w:br/>
-              <w:t>Technology_Stack.md</w:t>
-              <w:br/>
-              <w:t>How_to_Run_SCORM_Internally.md</w:t>
-              <w:br/>
-              <w:t>SolarPV_Client_Storyboard.html</w:t>
+              <w:t>Repo: https://github.com/nikhilsaini-iitj/Solar_PV_Adapt_SCORM12</w:t>
             </w:r>
           </w:p>
         </w:tc>
       </w:tr>
     </w:tbl>
-    <w:p/>
     <w:p>
       <w:pPr>
         <w:jc w:val="center"/>

</xml_diff>

<commit_message>
Regenerate Unit 2 storyboard from actual SCORM course JSON and VTT scripts
- Characters table

- Course structure summary mapped to real Adapt pages/articles/blocks/components

- 14 detailed scenes with VO, production notes, on-screen text

- Deliverables and live preview links

Co-Authored-By: Claude <noreply@anthropic.com>
</commit_message>
<xml_diff>
--- a/SolarPV_Unit2_Storyboard.docx
+++ b/SolarPV_Unit2_Storyboard.docx
@@ -10,9 +10,9 @@
         <w:rPr>
           <w:b/>
           <w:color w:val="0A1626"/>
-          <w:sz w:val="36"/>
+          <w:sz w:val="40"/>
         </w:rPr>
-        <w:t>Solar PV Unit 2 — Storyboard</w:t>
+        <w:t>Solar PV — Unit 2: Storyboard</w:t>
       </w:r>
     </w:p>
     <w:p>
@@ -22,9 +22,44 @@
       <w:r>
         <w:rPr>
           <w:color w:val="7D95B0"/>
-          <w:sz w:val="22"/>
+          <w:sz w:val="24"/>
         </w:rPr>
-        <w:t>Adapt Framework 5.56.2 · SCORM 1.2 · ~10–12 min</w:t>
+        <w:t>Choosing the Right Solar Panel · SCORM 1.2 · Adapt Framework 5.56.2</w:t>
+      </w:r>
+    </w:p>
+    <w:p/>
+    <w:p>
+      <w:r>
+        <w:rPr>
+          <w:b/>
+          <w:sz w:val="28"/>
+        </w:rPr>
+        <w:t>Module Overview</w:t>
+      </w:r>
+    </w:p>
+    <w:p>
+      <w:r>
+        <w:t>Title: Solar PV — Unit 2</w:t>
+      </w:r>
+    </w:p>
+    <w:p>
+      <w:r>
+        <w:t>Display Title: Choosing the Right Solar Panel</w:t>
+      </w:r>
+    </w:p>
+    <w:p>
+      <w:r>
+        <w:t>Description: An interactive chapter for a Level 2+ vocational course. The learner inspects a solar PV module, reads its specifications, differentiates the panel types, and completes a knowledge check.</w:t>
+      </w:r>
+    </w:p>
+    <w:p>
+      <w:r>
+        <w:t>Total Pages: 1</w:t>
+      </w:r>
+    </w:p>
+    <w:p>
+      <w:r>
+        <w:t>Latest Tracking ID: 33</w:t>
       </w:r>
     </w:p>
     <w:p/>
@@ -36,7 +71,7 @@
         <w:t xml:space="preserve">Client Need: </w:t>
       </w:r>
       <w:r>
-        <w:t>Field technicians and sales teams must identify solar panel parts, read datasheets, differentiate the three PV technologies, and confidently recommend the right panel for a site. This module turns the existing short-form video scripts into a trackable, mobile-first SCORM unit with interactive reinforcement and AR visualisation.</w:t>
+        <w:t>Field technicians and sales teams must identify solar panel parts, read datasheets, differentiate monocrystalline / polycrystalline / thin-film technologies, and confidently recommend the right panel for a customer site. This module replaces static product decks with a trackable, mobile-first, SCORM 1.2-compliant interactive learning unit.</w:t>
       </w:r>
     </w:p>
     <w:p/>
@@ -101,7 +136,7 @@
               <w:rPr>
                 <w:b/>
               </w:rPr>
-              <w:t>Names</w:t>
+              <w:t>Name</w:t>
             </w:r>
           </w:p>
         </w:tc>
@@ -238,7 +273,7 @@
           </w:tcPr>
           <w:p>
             <w:r>
-              <w:t>Confident, friendly guide who frames each scene and asks the learner to apply knowledge.</w:t>
+              <w:t>Confident, friendly guide; introduces each topic and asks the learner to apply knowledge.</w:t>
             </w:r>
           </w:p>
         </w:tc>
@@ -318,7 +353,7 @@
           </w:tcPr>
           <w:p>
             <w:r>
-              <w:t>Hands-on expert who points out real parts and explains specifications on site.</w:t>
+              <w:t>Hands-on expert; explains real-world parts, installation context, and datasheet values.</w:t>
             </w:r>
           </w:p>
         </w:tc>
@@ -398,7 +433,7 @@
           </w:tcPr>
           <w:p>
             <w:r>
-              <w:t>Represents the end-customer question: which panel, why, and how much space?</w:t>
+              <w:t>Represents the end customer whose questions the learner must answer (cost, space, type).</w:t>
             </w:r>
           </w:p>
         </w:tc>
@@ -548,7 +583,7 @@
           </w:tcPr>
           <w:p>
             <w:r>
-              <w:t>Black mono cells, silver frame, junction box</w:t>
+              <w:t>Black mono cells, silver aluminium frame, junction box</w:t>
             </w:r>
           </w:p>
         </w:tc>
@@ -558,7 +593,7 @@
           </w:tcPr>
           <w:p>
             <w:r>
-              <w:t>1.002 m × 1.690 m portrait PV module. Appears in 3D lab, diagrams, and AR.</w:t>
+              <w:t>1.002 m × 1.690 m portrait PV module. Used in 3D lab, diagrams, AR placement.</w:t>
             </w:r>
           </w:p>
         </w:tc>
@@ -581,9 +616,1104 @@
           <w:b/>
           <w:sz w:val="28"/>
         </w:rPr>
-        <w:t>Scene / Frame Table</w:t>
+        <w:t>Course Structure Summary</w:t>
       </w:r>
     </w:p>
+    <w:tbl>
+      <w:tblPr>
+        <w:tblStyle w:val="TableGrid"/>
+        <w:tblW w:type="auto" w:w="0"/>
+        <w:tblLook w:firstColumn="1" w:firstRow="1" w:lastColumn="0" w:lastRow="0" w:noHBand="0" w:noVBand="1" w:val="04A0"/>
+      </w:tblPr>
+      <w:tblGrid>
+        <w:gridCol w:w="1728"/>
+        <w:gridCol w:w="1728"/>
+        <w:gridCol w:w="1728"/>
+        <w:gridCol w:w="1728"/>
+        <w:gridCol w:w="1728"/>
+      </w:tblGrid>
+      <w:tr>
+        <w:tc>
+          <w:tcPr>
+            <w:tcW w:type="dxa" w:w="1728"/>
+          </w:tcPr>
+          <w:p>
+            <w:r>
+              <w:rPr>
+                <w:b/>
+              </w:rPr>
+              <w:t>Page ID</w:t>
+            </w:r>
+          </w:p>
+        </w:tc>
+        <w:tc>
+          <w:tcPr>
+            <w:tcW w:type="dxa" w:w="1728"/>
+          </w:tcPr>
+          <w:p>
+            <w:r>
+              <w:rPr>
+                <w:b/>
+              </w:rPr>
+              <w:t>Article Title</w:t>
+            </w:r>
+          </w:p>
+        </w:tc>
+        <w:tc>
+          <w:tcPr>
+            <w:tcW w:type="dxa" w:w="1728"/>
+          </w:tcPr>
+          <w:p>
+            <w:r>
+              <w:rPr>
+                <w:b/>
+              </w:rPr>
+              <w:t>Block Title</w:t>
+            </w:r>
+          </w:p>
+        </w:tc>
+        <w:tc>
+          <w:tcPr>
+            <w:tcW w:type="dxa" w:w="1728"/>
+          </w:tcPr>
+          <w:p>
+            <w:r>
+              <w:rPr>
+                <w:b/>
+              </w:rPr>
+              <w:t>Component</w:t>
+            </w:r>
+          </w:p>
+        </w:tc>
+        <w:tc>
+          <w:tcPr>
+            <w:tcW w:type="dxa" w:w="1728"/>
+          </w:tcPr>
+          <w:p>
+            <w:r>
+              <w:rPr>
+                <w:b/>
+              </w:rPr>
+              <w:t>Component Type</w:t>
+            </w:r>
+          </w:p>
+        </w:tc>
+      </w:tr>
+      <w:tr>
+        <w:tc>
+          <w:tcPr>
+            <w:tcW w:type="dxa" w:w="1728"/>
+          </w:tcPr>
+          <w:p>
+            <w:r>
+              <w:t>co-05</w:t>
+            </w:r>
+          </w:p>
+        </w:tc>
+        <w:tc>
+          <w:tcPr>
+            <w:tcW w:type="dxa" w:w="1728"/>
+          </w:tcPr>
+          <w:p>
+            <w:r>
+              <w:t>Welcome</w:t>
+            </w:r>
+          </w:p>
+        </w:tc>
+        <w:tc>
+          <w:tcPr>
+            <w:tcW w:type="dxa" w:w="1728"/>
+          </w:tcPr>
+          <w:p>
+            <w:r>
+              <w:t>Overview</w:t>
+            </w:r>
+          </w:p>
+        </w:tc>
+        <w:tc>
+          <w:tcPr>
+            <w:tcW w:type="dxa" w:w="1728"/>
+          </w:tcPr>
+          <w:p>
+            <w:r>
+              <w:t>Choosing the Right Solar Panel</w:t>
+            </w:r>
+          </w:p>
+        </w:tc>
+        <w:tc>
+          <w:tcPr>
+            <w:tcW w:type="dxa" w:w="1728"/>
+          </w:tcPr>
+          <w:p>
+            <w:r>
+              <w:t>media</w:t>
+            </w:r>
+          </w:p>
+        </w:tc>
+      </w:tr>
+      <w:tr>
+        <w:tc>
+          <w:tcPr>
+            <w:tcW w:type="dxa" w:w="1728"/>
+          </w:tcPr>
+          <w:p>
+            <w:r>
+              <w:t>co-05</w:t>
+            </w:r>
+          </w:p>
+        </w:tc>
+        <w:tc>
+          <w:tcPr>
+            <w:tcW w:type="dxa" w:w="1728"/>
+          </w:tcPr>
+          <w:p>
+            <w:r>
+              <w:t>From a cell to a module</w:t>
+            </w:r>
+          </w:p>
+        </w:tc>
+        <w:tc>
+          <w:tcPr>
+            <w:tcW w:type="dxa" w:w="1728"/>
+          </w:tcPr>
+          <w:p>
+            <w:r>
+              <w:t>From a cell to a module</w:t>
+            </w:r>
+          </w:p>
+        </w:tc>
+        <w:tc>
+          <w:tcPr>
+            <w:tcW w:type="dxa" w:w="1728"/>
+          </w:tcPr>
+          <w:p>
+            <w:r>
+              <w:t>From a cell to a module</w:t>
+            </w:r>
+          </w:p>
+        </w:tc>
+        <w:tc>
+          <w:tcPr>
+            <w:tcW w:type="dxa" w:w="1728"/>
+          </w:tcPr>
+          <w:p>
+            <w:r>
+              <w:t>media</w:t>
+            </w:r>
+          </w:p>
+        </w:tc>
+      </w:tr>
+      <w:tr>
+        <w:tc>
+          <w:tcPr>
+            <w:tcW w:type="dxa" w:w="1728"/>
+          </w:tcPr>
+          <w:p>
+            <w:r>
+              <w:t>co-05</w:t>
+            </w:r>
+          </w:p>
+        </w:tc>
+        <w:tc>
+          <w:tcPr>
+            <w:tcW w:type="dxa" w:w="1728"/>
+          </w:tcPr>
+          <w:p>
+            <w:r>
+              <w:t>Inside the module</w:t>
+            </w:r>
+          </w:p>
+        </w:tc>
+        <w:tc>
+          <w:tcPr>
+            <w:tcW w:type="dxa" w:w="1728"/>
+          </w:tcPr>
+          <w:p>
+            <w:r>
+              <w:t>Inside the module video</w:t>
+            </w:r>
+          </w:p>
+        </w:tc>
+        <w:tc>
+          <w:tcPr>
+            <w:tcW w:type="dxa" w:w="1728"/>
+          </w:tcPr>
+          <w:p>
+            <w:r>
+              <w:t>Inside the module</w:t>
+            </w:r>
+          </w:p>
+        </w:tc>
+        <w:tc>
+          <w:tcPr>
+            <w:tcW w:type="dxa" w:w="1728"/>
+          </w:tcPr>
+          <w:p>
+            <w:r>
+              <w:t>media</w:t>
+            </w:r>
+          </w:p>
+        </w:tc>
+      </w:tr>
+      <w:tr>
+        <w:tc>
+          <w:tcPr>
+            <w:tcW w:type="dxa" w:w="1728"/>
+          </w:tcPr>
+          <w:p>
+            <w:r>
+              <w:t>co-05</w:t>
+            </w:r>
+          </w:p>
+        </w:tc>
+        <w:tc>
+          <w:tcPr>
+            <w:tcW w:type="dxa" w:w="1728"/>
+          </w:tcPr>
+          <w:p>
+            <w:r>
+              <w:t>Inside the module</w:t>
+            </w:r>
+          </w:p>
+        </w:tc>
+        <w:tc>
+          <w:tcPr>
+            <w:tcW w:type="dxa" w:w="1728"/>
+          </w:tcPr>
+          <w:p>
+            <w:r>
+              <w:t>Module cross-section</w:t>
+            </w:r>
+          </w:p>
+        </w:tc>
+        <w:tc>
+          <w:tcPr>
+            <w:tcW w:type="dxa" w:w="1728"/>
+          </w:tcPr>
+          <w:p>
+            <w:r>
+              <w:t>Module cross-section</w:t>
+            </w:r>
+          </w:p>
+        </w:tc>
+        <w:tc>
+          <w:tcPr>
+            <w:tcW w:type="dxa" w:w="1728"/>
+          </w:tcPr>
+          <w:p>
+            <w:r>
+              <w:t>graphic</w:t>
+            </w:r>
+          </w:p>
+        </w:tc>
+      </w:tr>
+      <w:tr>
+        <w:tc>
+          <w:tcPr>
+            <w:tcW w:type="dxa" w:w="1728"/>
+          </w:tcPr>
+          <w:p>
+            <w:r>
+              <w:t>co-05</w:t>
+            </w:r>
+          </w:p>
+        </w:tc>
+        <w:tc>
+          <w:tcPr>
+            <w:tcW w:type="dxa" w:w="1728"/>
+          </w:tcPr>
+          <w:p>
+            <w:r>
+              <w:t>The three technologies</w:t>
+            </w:r>
+          </w:p>
+        </w:tc>
+        <w:tc>
+          <w:tcPr>
+            <w:tcW w:type="dxa" w:w="1728"/>
+          </w:tcPr>
+          <w:p>
+            <w:r>
+              <w:t>The three technologies</w:t>
+            </w:r>
+          </w:p>
+        </w:tc>
+        <w:tc>
+          <w:tcPr>
+            <w:tcW w:type="dxa" w:w="1728"/>
+          </w:tcPr>
+          <w:p>
+            <w:r>
+              <w:t>The three technologies</w:t>
+            </w:r>
+          </w:p>
+        </w:tc>
+        <w:tc>
+          <w:tcPr>
+            <w:tcW w:type="dxa" w:w="1728"/>
+          </w:tcPr>
+          <w:p>
+            <w:r>
+              <w:t>media</w:t>
+            </w:r>
+          </w:p>
+        </w:tc>
+      </w:tr>
+      <w:tr>
+        <w:tc>
+          <w:tcPr>
+            <w:tcW w:type="dxa" w:w="1728"/>
+          </w:tcPr>
+          <w:p>
+            <w:r>
+              <w:t>co-05</w:t>
+            </w:r>
+          </w:p>
+        </w:tc>
+        <w:tc>
+          <w:tcPr>
+            <w:tcW w:type="dxa" w:w="1728"/>
+          </w:tcPr>
+          <w:p>
+            <w:r>
+              <w:t>The three technologies</w:t>
+            </w:r>
+          </w:p>
+        </w:tc>
+        <w:tc>
+          <w:tcPr>
+            <w:tcW w:type="dxa" w:w="1728"/>
+          </w:tcPr>
+          <w:p>
+            <w:r>
+              <w:t>Panel comparison</w:t>
+            </w:r>
+          </w:p>
+        </w:tc>
+        <w:tc>
+          <w:tcPr>
+            <w:tcW w:type="dxa" w:w="1728"/>
+          </w:tcPr>
+          <w:p>
+            <w:r>
+              <w:t>The three panel families</w:t>
+            </w:r>
+          </w:p>
+        </w:tc>
+        <w:tc>
+          <w:tcPr>
+            <w:tcW w:type="dxa" w:w="1728"/>
+          </w:tcPr>
+          <w:p>
+            <w:r>
+              <w:t>narrative</w:t>
+            </w:r>
+          </w:p>
+        </w:tc>
+      </w:tr>
+      <w:tr>
+        <w:tc>
+          <w:tcPr>
+            <w:tcW w:type="dxa" w:w="1728"/>
+          </w:tcPr>
+          <w:p>
+            <w:r>
+              <w:t>co-05</w:t>
+            </w:r>
+          </w:p>
+        </w:tc>
+        <w:tc>
+          <w:tcPr>
+            <w:tcW w:type="dxa" w:w="1728"/>
+          </w:tcPr>
+          <w:p>
+            <w:r>
+              <w:t>Reading specifications</w:t>
+            </w:r>
+          </w:p>
+        </w:tc>
+        <w:tc>
+          <w:tcPr>
+            <w:tcW w:type="dxa" w:w="1728"/>
+          </w:tcPr>
+          <w:p>
+            <w:r>
+              <w:t>Reading specifications</w:t>
+            </w:r>
+          </w:p>
+        </w:tc>
+        <w:tc>
+          <w:tcPr>
+            <w:tcW w:type="dxa" w:w="1728"/>
+          </w:tcPr>
+          <w:p>
+            <w:r>
+              <w:t>Reading specifications</w:t>
+            </w:r>
+          </w:p>
+        </w:tc>
+        <w:tc>
+          <w:tcPr>
+            <w:tcW w:type="dxa" w:w="1728"/>
+          </w:tcPr>
+          <w:p>
+            <w:r>
+              <w:t>media</w:t>
+            </w:r>
+          </w:p>
+        </w:tc>
+      </w:tr>
+      <w:tr>
+        <w:tc>
+          <w:tcPr>
+            <w:tcW w:type="dxa" w:w="1728"/>
+          </w:tcPr>
+          <w:p>
+            <w:r>
+              <w:t>co-05</w:t>
+            </w:r>
+          </w:p>
+        </w:tc>
+        <w:tc>
+          <w:tcPr>
+            <w:tcW w:type="dxa" w:w="1728"/>
+          </w:tcPr>
+          <w:p>
+            <w:r>
+              <w:t>Reading specifications</w:t>
+            </w:r>
+          </w:p>
+        </w:tc>
+        <w:tc>
+          <w:tcPr>
+            <w:tcW w:type="dxa" w:w="1728"/>
+          </w:tcPr>
+          <w:p>
+            <w:r>
+              <w:t>Spec sheet values</w:t>
+            </w:r>
+          </w:p>
+        </w:tc>
+        <w:tc>
+          <w:tcPr>
+            <w:tcW w:type="dxa" w:w="1728"/>
+          </w:tcPr>
+          <w:p>
+            <w:r>
+              <w:t>What capacity means</w:t>
+            </w:r>
+          </w:p>
+        </w:tc>
+        <w:tc>
+          <w:tcPr>
+            <w:tcW w:type="dxa" w:w="1728"/>
+          </w:tcPr>
+          <w:p>
+            <w:r>
+              <w:t>text</w:t>
+            </w:r>
+          </w:p>
+        </w:tc>
+      </w:tr>
+      <w:tr>
+        <w:tc>
+          <w:tcPr>
+            <w:tcW w:type="dxa" w:w="1728"/>
+          </w:tcPr>
+          <w:p>
+            <w:r>
+              <w:t>co-05</w:t>
+            </w:r>
+          </w:p>
+        </w:tc>
+        <w:tc>
+          <w:tcPr>
+            <w:tcW w:type="dxa" w:w="1728"/>
+          </w:tcPr>
+          <w:p>
+            <w:r>
+              <w:t>3D virtual lab</w:t>
+            </w:r>
+          </w:p>
+        </w:tc>
+        <w:tc>
+          <w:tcPr>
+            <w:tcW w:type="dxa" w:w="1728"/>
+          </w:tcPr>
+          <w:p>
+            <w:r>
+              <w:t>Open the 3D lab</w:t>
+            </w:r>
+          </w:p>
+        </w:tc>
+        <w:tc>
+          <w:tcPr>
+            <w:tcW w:type="dxa" w:w="1728"/>
+          </w:tcPr>
+          <w:p>
+            <w:r>
+              <w:t>Open the 3D virtual lab</w:t>
+            </w:r>
+          </w:p>
+        </w:tc>
+        <w:tc>
+          <w:tcPr>
+            <w:tcW w:type="dxa" w:w="1728"/>
+          </w:tcPr>
+          <w:p>
+            <w:r>
+              <w:t>solar-embed</w:t>
+            </w:r>
+          </w:p>
+        </w:tc>
+      </w:tr>
+      <w:tr>
+        <w:tc>
+          <w:tcPr>
+            <w:tcW w:type="dxa" w:w="1728"/>
+          </w:tcPr>
+          <w:p>
+            <w:r>
+              <w:t>co-05</w:t>
+            </w:r>
+          </w:p>
+        </w:tc>
+        <w:tc>
+          <w:tcPr>
+            <w:tcW w:type="dxa" w:w="1728"/>
+          </w:tcPr>
+          <w:p>
+            <w:r>
+              <w:t>AR experience</w:t>
+            </w:r>
+          </w:p>
+        </w:tc>
+        <w:tc>
+          <w:tcPr>
+            <w:tcW w:type="dxa" w:w="1728"/>
+          </w:tcPr>
+          <w:p>
+            <w:r>
+              <w:t>AR view</w:t>
+            </w:r>
+          </w:p>
+        </w:tc>
+        <w:tc>
+          <w:tcPr>
+            <w:tcW w:type="dxa" w:w="1728"/>
+          </w:tcPr>
+          <w:p>
+            <w:r>
+              <w:t>View the panel in your space</w:t>
+            </w:r>
+          </w:p>
+        </w:tc>
+        <w:tc>
+          <w:tcPr>
+            <w:tcW w:type="dxa" w:w="1728"/>
+          </w:tcPr>
+          <w:p>
+            <w:r>
+              <w:t>solar-embed</w:t>
+            </w:r>
+          </w:p>
+        </w:tc>
+      </w:tr>
+      <w:tr>
+        <w:tc>
+          <w:tcPr>
+            <w:tcW w:type="dxa" w:w="1728"/>
+          </w:tcPr>
+          <w:p>
+            <w:r>
+              <w:t>co-05</w:t>
+            </w:r>
+          </w:p>
+        </w:tc>
+        <w:tc>
+          <w:tcPr>
+            <w:tcW w:type="dxa" w:w="1728"/>
+          </w:tcPr>
+          <w:p>
+            <w:r>
+              <w:t>Interactive component lab</w:t>
+            </w:r>
+          </w:p>
+        </w:tc>
+        <w:tc>
+          <w:tcPr>
+            <w:tcW w:type="dxa" w:w="1728"/>
+          </w:tcPr>
+          <w:p>
+            <w:r>
+              <w:t>Interactive tools</w:t>
+            </w:r>
+          </w:p>
+        </w:tc>
+        <w:tc>
+          <w:tcPr>
+            <w:tcW w:type="dxa" w:w="1728"/>
+          </w:tcPr>
+          <w:p>
+            <w:r>
+              <w:t>Interactive component lab</w:t>
+            </w:r>
+          </w:p>
+        </w:tc>
+        <w:tc>
+          <w:tcPr>
+            <w:tcW w:type="dxa" w:w="1728"/>
+          </w:tcPr>
+          <w:p>
+            <w:r>
+              <w:t>solar-embed</w:t>
+            </w:r>
+          </w:p>
+        </w:tc>
+      </w:tr>
+      <w:tr>
+        <w:tc>
+          <w:tcPr>
+            <w:tcW w:type="dxa" w:w="1728"/>
+          </w:tcPr>
+          <w:p>
+            <w:r>
+              <w:t>co-05</w:t>
+            </w:r>
+          </w:p>
+        </w:tc>
+        <w:tc>
+          <w:tcPr>
+            <w:tcW w:type="dxa" w:w="1728"/>
+          </w:tcPr>
+          <w:p>
+            <w:r>
+              <w:t>System energy flow</w:t>
+            </w:r>
+          </w:p>
+        </w:tc>
+        <w:tc>
+          <w:tcPr>
+            <w:tcW w:type="dxa" w:w="1728"/>
+          </w:tcPr>
+          <w:p>
+            <w:r>
+              <w:t>Interactive system diagram</w:t>
+            </w:r>
+          </w:p>
+        </w:tc>
+        <w:tc>
+          <w:tcPr>
+            <w:tcW w:type="dxa" w:w="1728"/>
+          </w:tcPr>
+          <w:p>
+            <w:r>
+              <w:t>System energy flow</w:t>
+            </w:r>
+          </w:p>
+        </w:tc>
+        <w:tc>
+          <w:tcPr>
+            <w:tcW w:type="dxa" w:w="1728"/>
+          </w:tcPr>
+          <w:p>
+            <w:r>
+              <w:t>solar-embed</w:t>
+            </w:r>
+          </w:p>
+        </w:tc>
+      </w:tr>
+      <w:tr>
+        <w:tc>
+          <w:tcPr>
+            <w:tcW w:type="dxa" w:w="1728"/>
+          </w:tcPr>
+          <w:p>
+            <w:r>
+              <w:t>co-05</w:t>
+            </w:r>
+          </w:p>
+        </w:tc>
+        <w:tc>
+          <w:tcPr>
+            <w:tcW w:type="dxa" w:w="1728"/>
+          </w:tcPr>
+          <w:p>
+            <w:r>
+              <w:t>Panel parts &amp; specifications</w:t>
+            </w:r>
+          </w:p>
+        </w:tc>
+        <w:tc>
+          <w:tcPr>
+            <w:tcW w:type="dxa" w:w="1728"/>
+          </w:tcPr>
+          <w:p>
+            <w:r>
+              <w:t>Panel parts and specifications</w:t>
+            </w:r>
+          </w:p>
+        </w:tc>
+        <w:tc>
+          <w:tcPr>
+            <w:tcW w:type="dxa" w:w="1728"/>
+          </w:tcPr>
+          <w:p>
+            <w:r>
+              <w:t>Panel parts and specifications</w:t>
+            </w:r>
+          </w:p>
+        </w:tc>
+        <w:tc>
+          <w:tcPr>
+            <w:tcW w:type="dxa" w:w="1728"/>
+          </w:tcPr>
+          <w:p>
+            <w:r>
+              <w:t>solar-embed</w:t>
+            </w:r>
+          </w:p>
+        </w:tc>
+      </w:tr>
+      <w:tr>
+        <w:tc>
+          <w:tcPr>
+            <w:tcW w:type="dxa" w:w="1728"/>
+          </w:tcPr>
+          <w:p>
+            <w:r>
+              <w:t>co-05</w:t>
+            </w:r>
+          </w:p>
+        </w:tc>
+        <w:tc>
+          <w:tcPr>
+            <w:tcW w:type="dxa" w:w="1728"/>
+          </w:tcPr>
+          <w:p>
+            <w:r>
+              <w:t>P-N junction simulation</w:t>
+            </w:r>
+          </w:p>
+        </w:tc>
+        <w:tc>
+          <w:tcPr>
+            <w:tcW w:type="dxa" w:w="1728"/>
+          </w:tcPr>
+          <w:p>
+            <w:r>
+              <w:t>P-N junction simulation</w:t>
+            </w:r>
+          </w:p>
+        </w:tc>
+        <w:tc>
+          <w:tcPr>
+            <w:tcW w:type="dxa" w:w="1728"/>
+          </w:tcPr>
+          <w:p>
+            <w:r>
+              <w:t>P-N junction simulation</w:t>
+            </w:r>
+          </w:p>
+        </w:tc>
+        <w:tc>
+          <w:tcPr>
+            <w:tcW w:type="dxa" w:w="1728"/>
+          </w:tcPr>
+          <w:p>
+            <w:r>
+              <w:t>solar-embed</w:t>
+            </w:r>
+          </w:p>
+        </w:tc>
+      </w:tr>
+      <w:tr>
+        <w:tc>
+          <w:tcPr>
+            <w:tcW w:type="dxa" w:w="1728"/>
+          </w:tcPr>
+          <w:p>
+            <w:r>
+              <w:t>co-05</w:t>
+            </w:r>
+          </w:p>
+        </w:tc>
+        <w:tc>
+          <w:tcPr>
+            <w:tcW w:type="dxa" w:w="1728"/>
+          </w:tcPr>
+          <w:p>
+            <w:r>
+              <w:t>Electrical safety</w:t>
+            </w:r>
+          </w:p>
+        </w:tc>
+        <w:tc>
+          <w:tcPr>
+            <w:tcW w:type="dxa" w:w="1728"/>
+          </w:tcPr>
+          <w:p>
+            <w:r>
+              <w:t>Safety lab</w:t>
+            </w:r>
+          </w:p>
+        </w:tc>
+        <w:tc>
+          <w:tcPr>
+            <w:tcW w:type="dxa" w:w="1728"/>
+          </w:tcPr>
+          <w:p>
+            <w:r>
+              <w:t>Electrical safety lab</w:t>
+            </w:r>
+          </w:p>
+        </w:tc>
+        <w:tc>
+          <w:tcPr>
+            <w:tcW w:type="dxa" w:w="1728"/>
+          </w:tcPr>
+          <w:p>
+            <w:r>
+              <w:t>solar-embed</w:t>
+            </w:r>
+          </w:p>
+        </w:tc>
+      </w:tr>
+      <w:tr>
+        <w:tc>
+          <w:tcPr>
+            <w:tcW w:type="dxa" w:w="1728"/>
+          </w:tcPr>
+          <w:p>
+            <w:r>
+              <w:t>co-05</w:t>
+            </w:r>
+          </w:p>
+        </w:tc>
+        <w:tc>
+          <w:tcPr>
+            <w:tcW w:type="dxa" w:w="1728"/>
+          </w:tcPr>
+          <w:p>
+            <w:r>
+              <w:t>Knowledge check</w:t>
+            </w:r>
+          </w:p>
+        </w:tc>
+        <w:tc>
+          <w:tcPr>
+            <w:tcW w:type="dxa" w:w="1728"/>
+          </w:tcPr>
+          <w:p>
+            <w:r>
+              <w:t>Q1</w:t>
+            </w:r>
+          </w:p>
+        </w:tc>
+        <w:tc>
+          <w:tcPr>
+            <w:tcW w:type="dxa" w:w="1728"/>
+          </w:tcPr>
+          <w:p>
+            <w:r>
+              <w:t>Question 1</w:t>
+            </w:r>
+          </w:p>
+        </w:tc>
+        <w:tc>
+          <w:tcPr>
+            <w:tcW w:type="dxa" w:w="1728"/>
+          </w:tcPr>
+          <w:p>
+            <w:r>
+              <w:t>mcq</w:t>
+            </w:r>
+          </w:p>
+        </w:tc>
+      </w:tr>
+      <w:tr>
+        <w:tc>
+          <w:tcPr>
+            <w:tcW w:type="dxa" w:w="1728"/>
+          </w:tcPr>
+          <w:p>
+            <w:r>
+              <w:t>co-05</w:t>
+            </w:r>
+          </w:p>
+        </w:tc>
+        <w:tc>
+          <w:tcPr>
+            <w:tcW w:type="dxa" w:w="1728"/>
+          </w:tcPr>
+          <w:p>
+            <w:r>
+              <w:t>Knowledge check</w:t>
+            </w:r>
+          </w:p>
+        </w:tc>
+        <w:tc>
+          <w:tcPr>
+            <w:tcW w:type="dxa" w:w="1728"/>
+          </w:tcPr>
+          <w:p>
+            <w:r>
+              <w:t>Q2</w:t>
+            </w:r>
+          </w:p>
+        </w:tc>
+        <w:tc>
+          <w:tcPr>
+            <w:tcW w:type="dxa" w:w="1728"/>
+          </w:tcPr>
+          <w:p>
+            <w:r>
+              <w:t>Question 2</w:t>
+            </w:r>
+          </w:p>
+        </w:tc>
+        <w:tc>
+          <w:tcPr>
+            <w:tcW w:type="dxa" w:w="1728"/>
+          </w:tcPr>
+          <w:p>
+            <w:r>
+              <w:t>mcq</w:t>
+            </w:r>
+          </w:p>
+        </w:tc>
+      </w:tr>
+      <w:tr>
+        <w:tc>
+          <w:tcPr>
+            <w:tcW w:type="dxa" w:w="1728"/>
+          </w:tcPr>
+          <w:p>
+            <w:r>
+              <w:t>co-05</w:t>
+            </w:r>
+          </w:p>
+        </w:tc>
+        <w:tc>
+          <w:tcPr>
+            <w:tcW w:type="dxa" w:w="1728"/>
+          </w:tcPr>
+          <w:p>
+            <w:r>
+              <w:t>Knowledge check</w:t>
+            </w:r>
+          </w:p>
+        </w:tc>
+        <w:tc>
+          <w:tcPr>
+            <w:tcW w:type="dxa" w:w="1728"/>
+          </w:tcPr>
+          <w:p>
+            <w:r>
+              <w:t>Q3</w:t>
+            </w:r>
+          </w:p>
+        </w:tc>
+        <w:tc>
+          <w:tcPr>
+            <w:tcW w:type="dxa" w:w="1728"/>
+          </w:tcPr>
+          <w:p>
+            <w:r>
+              <w:t>Question 3</w:t>
+            </w:r>
+          </w:p>
+        </w:tc>
+        <w:tc>
+          <w:tcPr>
+            <w:tcW w:type="dxa" w:w="1728"/>
+          </w:tcPr>
+          <w:p>
+            <w:r>
+              <w:t>matching</w:t>
+            </w:r>
+          </w:p>
+        </w:tc>
+      </w:tr>
+      <w:tr>
+        <w:tc>
+          <w:tcPr>
+            <w:tcW w:type="dxa" w:w="1728"/>
+          </w:tcPr>
+          <w:p>
+            <w:r>
+              <w:t>co-05</w:t>
+            </w:r>
+          </w:p>
+        </w:tc>
+        <w:tc>
+          <w:tcPr>
+            <w:tcW w:type="dxa" w:w="1728"/>
+          </w:tcPr>
+          <w:p>
+            <w:r>
+              <w:t>Summary</w:t>
+            </w:r>
+          </w:p>
+        </w:tc>
+        <w:tc>
+          <w:tcPr>
+            <w:tcW w:type="dxa" w:w="1728"/>
+          </w:tcPr>
+          <w:p>
+            <w:r>
+              <w:t>Summary</w:t>
+            </w:r>
+          </w:p>
+        </w:tc>
+        <w:tc>
+          <w:tcPr>
+            <w:tcW w:type="dxa" w:w="1728"/>
+          </w:tcPr>
+          <w:p>
+            <w:r>
+              <w:t>Summary</w:t>
+            </w:r>
+          </w:p>
+        </w:tc>
+        <w:tc>
+          <w:tcPr>
+            <w:tcW w:type="dxa" w:w="1728"/>
+          </w:tcPr>
+          <w:p>
+            <w:r>
+              <w:t>media</w:t>
+            </w:r>
+          </w:p>
+        </w:tc>
+      </w:tr>
+    </w:tbl>
+    <w:p>
+      <w:r>
+        <w:br w:type="page"/>
+      </w:r>
+    </w:p>
+    <w:p>
+      <w:r>
+        <w:rPr>
+          <w:b/>
+          <w:sz w:val="28"/>
+        </w:rPr>
+        <w:t>Detailed Scene / Frame Table</w:t>
+      </w:r>
+    </w:p>
+    <w:p>
+      <w:r>
+        <w:rPr>
+          <w:b/>
+        </w:rPr>
+        <w:t xml:space="preserve">Client Need: </w:t>
+      </w:r>
+      <w:r>
+        <w:t>Enable learners to inspect a PV module, read its specifications, differentiate the three panel types, and recommend the right panel for a site. Each scene maps to the actual Adapt articles, blocks, and components shipped in the SCORM package.</w:t>
+      </w:r>
+    </w:p>
+    <w:p/>
     <w:tbl>
       <w:tblPr>
         <w:tblStyle w:val="TableGrid"/>
@@ -656,12 +1786,29 @@
             <w:tcW w:type="dxa" w:w="2160"/>
           </w:tcPr>
           <w:p>
+            <w:r/>
             <w:r>
               <w:t>Scene 1</w:t>
-              <w:br/>
+            </w:r>
+          </w:p>
+          <w:p>
+            <w:r>
               <w:t>Welcome</w:t>
-              <w:br/>
-              <w:t>1:40</w:t>
+            </w:r>
+          </w:p>
+          <w:p>
+            <w:r>
+              <w:t>Article: a-10</w:t>
+            </w:r>
+          </w:p>
+          <w:p>
+            <w:r>
+              <w:t>Block: b-10</w:t>
+            </w:r>
+          </w:p>
+          <w:p>
+            <w:r>
+              <w:t>Component: c-10</w:t>
             </w:r>
           </w:p>
         </w:tc>
@@ -670,9 +1817,13 @@
             <w:tcW w:type="dxa" w:w="2160"/>
           </w:tcPr>
           <w:p>
+            <w:r/>
             <w:r>
               <w:t>Narrator (Arjun):</w:t>
-              <w:br/>
+            </w:r>
+          </w:p>
+          <w:p>
+            <w:r>
               <w:t>Welcome to this module on choosing the right solar panel. You'll learn to identify the parts of a module, read its specifications, tell the three panel types apart, and recommend the right panel for a site.</w:t>
             </w:r>
           </w:p>
@@ -682,8 +1833,9 @@
             <w:tcW w:type="dxa" w:w="2160"/>
           </w:tcPr>
           <w:p>
-            <w:r>
-              <w:t>Course menu tile shows dusk rooftop wallpaper, first-frame video thumbnail, and a blue "Begin module" CTA. Header uses client palette: deep navy, amber sun, panel silhouettes, gold corner brackets. Animated simulated-output widget in the header.</w:t>
+            <w:r/>
+            <w:r>
+              <w:t>Adapt media component 'Choosing the Right Solar Panel' plays the welcome video (course/en/Solar_PV_Module_Video.mp4) with closed captions and first-frame thumbnail. Article class 'solar-dark solar-wallpaper-dark' applies the dark solar wallpaper. Trickle locking shows a 'Begin module' button. Completion is set on video play.</w:t>
             </w:r>
           </w:p>
         </w:tc>
@@ -692,12 +1844,19 @@
             <w:tcW w:type="dxa" w:w="2160"/>
           </w:tcPr>
           <w:p>
+            <w:r/>
             <w:r>
               <w:t>Title: Choosing the Right Solar Panel</w:t>
-              <w:br/>
-              <w:t>Subtitle: Solar PV Unit 2 — ~12 min</w:t>
-              <w:br/>
-              <w:t>CTA: Begin module</w:t>
+            </w:r>
+          </w:p>
+          <w:p>
+            <w:r>
+              <w:t>An interactive chapter for a Level 2+ vocational course. You will inspect a solar PV module, read its specifications, differentiate the panel types, and complete a knowledge check.&lt;br&gt;&lt;br&gt;&lt;strong&gt;Click the blue “Begin module” button below to start.&lt;/strong&gt;</w:t>
+            </w:r>
+          </w:p>
+          <w:p>
+            <w:r>
+              <w:t>Instruction: Press play to start the video. Use the CC button for captions.</w:t>
             </w:r>
           </w:p>
         </w:tc>
@@ -708,12 +1867,29 @@
             <w:tcW w:type="dxa" w:w="2160"/>
           </w:tcPr>
           <w:p>
+            <w:r/>
             <w:r>
               <w:t>Scene 2</w:t>
-              <w:br/>
+            </w:r>
+          </w:p>
+          <w:p>
+            <w:r>
               <w:t>From a Cell to a Module</w:t>
-              <w:br/>
-              <w:t>2:10</w:t>
+            </w:r>
+          </w:p>
+          <w:p>
+            <w:r>
+              <w:t>Article: a-15</w:t>
+            </w:r>
+          </w:p>
+          <w:p>
+            <w:r>
+              <w:t>Block: b-15</w:t>
+            </w:r>
+          </w:p>
+          <w:p>
+            <w:r>
+              <w:t>Component: c-15</w:t>
             </w:r>
           </w:p>
         </w:tc>
@@ -722,9 +1898,13 @@
             <w:tcW w:type="dxa" w:w="2160"/>
           </w:tcPr>
           <w:p>
-            <w:r>
-              <w:t>Divya (Lab Technician):</w:t>
-              <w:br/>
+            <w:r/>
+            <w:r>
+              <w:t>Lab Technician (Divya):</w:t>
+            </w:r>
+          </w:p>
+          <w:p>
+            <w:r>
               <w:t>A single cell makes only about half a volt. Wire many cells together and seal them, and you get a module. Connect modules together and you get an array.</w:t>
             </w:r>
           </w:p>
@@ -734,8 +1914,9 @@
             <w:tcW w:type="dxa" w:w="2160"/>
           </w:tcPr>
           <w:p>
-            <w:r>
-              <w:t>Media component plays the video with burned-in captions. Below the video, a solar-embed interactive shows the cell-to-module zoom with hotspots. A second embedded interactive (P-N junction simulation) lets the learner fire a photon and watch charge separation. Both launch full-screen.</w:t>
+            <w:r/>
+            <w:r>
+              <w:t>Media component plays 02_Cell_to_Module.mp4 with VTT captions. Article uses light wallpaper class 'solar-surface solar-wallpaper-light'. Completion set on play. The P-N junction simulation follows in Scene 11.</w:t>
             </w:r>
           </w:p>
         </w:tc>
@@ -744,12 +1925,14 @@
             <w:tcW w:type="dxa" w:w="2160"/>
           </w:tcPr>
           <w:p>
-            <w:r>
-              <w:t>Labels: Cell, Busbar, EVA, Glass, Backsheet, Frame</w:t>
-              <w:br/>
-              <w:t>CTA 1: Launch P-N junction simulation</w:t>
-              <w:br/>
-              <w:t>CTA 2: Launch full-screen cell diagram</w:t>
+            <w:r/>
+            <w:r>
+              <w:t>Title: From a cell to a module</w:t>
+            </w:r>
+          </w:p>
+          <w:p>
+            <w:r>
+              <w:t>Electricity from the sun starts in a single solar cell. Wire many cells together and seal them, and you get a module.</w:t>
             </w:r>
           </w:p>
         </w:tc>
@@ -760,12 +1943,29 @@
             <w:tcW w:type="dxa" w:w="2160"/>
           </w:tcPr>
           <w:p>
+            <w:r/>
             <w:r>
               <w:t>Scene 3</w:t>
-              <w:br/>
+            </w:r>
+          </w:p>
+          <w:p>
+            <w:r>
               <w:t>Inside the Module</w:t>
-              <w:br/>
-              <w:t>2:00</w:t>
+            </w:r>
+          </w:p>
+          <w:p>
+            <w:r>
+              <w:t>Article: a-20</w:t>
+            </w:r>
+          </w:p>
+          <w:p>
+            <w:r>
+              <w:t>Blocks: b-20, b-21</w:t>
+            </w:r>
+          </w:p>
+          <w:p>
+            <w:r>
+              <w:t>Components: c-20, c-21</w:t>
             </w:r>
           </w:p>
         </w:tc>
@@ -774,9 +1974,13 @@
             <w:tcW w:type="dxa" w:w="2160"/>
           </w:tcPr>
           <w:p>
-            <w:r>
-              <w:t>Meera (Site Engineer):</w:t>
-              <w:br/>
+            <w:r/>
+            <w:r>
+              <w:t>Site Engineer (Meera):</w:t>
+            </w:r>
+          </w:p>
+          <w:p>
+            <w:r>
               <w:t>A module is a sealed sandwich built to last 25 years. Tempered glass on top, cells sealed between two layers of EVA, a weatherproof back-sheet, an aluminium frame, and a junction box.</w:t>
             </w:r>
           </w:p>
@@ -786,8 +1990,9 @@
             <w:tcW w:type="dxa" w:w="2160"/>
           </w:tcPr>
           <w:p>
-            <w:r>
-              <w:t>Video with first-frame thumbnail. Followed by 3D virtual lab embed: rotate panel, explode layers, switch Mono/Poly/Thin-film, adjust sun and temperature. Then the system energy flow diagram with day/night toggle and clickable rooftop components.</w:t>
+            <w:r/>
+            <w:r>
+              <w:t>Media component 'Inside the module' plays 03_Inside_the_Module.mp4. Graphic component 'Module cross-section' shows the module cross-section PNG (course/en/images/module-cross-section.png). Article 'Inside the module' uses trickle with Continue button between blocks.</w:t>
             </w:r>
           </w:p>
         </w:tc>
@@ -796,10 +2001,19 @@
             <w:tcW w:type="dxa" w:w="2160"/>
           </w:tcPr>
           <w:p>
-            <w:r>
-              <w:t>3D Lab labels: Tempered glass, EVA, Cells, Backsheet, Frame, Junction box</w:t>
-              <w:br/>
-              <w:t>Diagram labels: Panels, Inverter, Battery, Loads, Grid</w:t>
+            <w:r/>
+            <w:r>
+              <w:t>Video title: Inside the module</w:t>
+            </w:r>
+          </w:p>
+          <w:p>
+            <w:r>
+              <w:t>A solar PV module is a sealed sandwich built to survive 25 years outdoors.</w:t>
+            </w:r>
+          </w:p>
+          <w:p>
+            <w:r>
+              <w:t>Graphic alt: Exploded cross-section of a solar PV module showing glass, EVA, cells, back-sheet, frame and junction box</w:t>
             </w:r>
           </w:p>
         </w:tc>
@@ -810,12 +2024,29 @@
             <w:tcW w:type="dxa" w:w="2160"/>
           </w:tcPr>
           <w:p>
+            <w:r/>
             <w:r>
               <w:t>Scene 4</w:t>
-              <w:br/>
+            </w:r>
+          </w:p>
+          <w:p>
+            <w:r>
               <w:t>The Three Technologies</w:t>
-              <w:br/>
-              <w:t>1:50</w:t>
+            </w:r>
+          </w:p>
+          <w:p>
+            <w:r>
+              <w:t>Article: a-25</w:t>
+            </w:r>
+          </w:p>
+          <w:p>
+            <w:r>
+              <w:t>Blocks: b-25, b-26</w:t>
+            </w:r>
+          </w:p>
+          <w:p>
+            <w:r>
+              <w:t>Components: c-25, c-26</w:t>
             </w:r>
           </w:p>
         </w:tc>
@@ -824,9 +2055,13 @@
             <w:tcW w:type="dxa" w:w="2160"/>
           </w:tcPr>
           <w:p>
+            <w:r/>
             <w:r>
               <w:t>Narrator (Arjun):</w:t>
-              <w:br/>
+            </w:r>
+          </w:p>
+          <w:p>
+            <w:r>
               <w:t>Monocrystalline is black and the most efficient. Polycrystalline is blue and easier on the budget. Thin-film is flexible and the calmest in high heat. The site decides the choice.</w:t>
             </w:r>
           </w:p>
@@ -836,8 +2071,9 @@
             <w:tcW w:type="dxa" w:w="2160"/>
           </w:tcPr>
           <w:p>
-            <w:r>
-              <w:t>Media component with video. Followed by a Narrative component with three swipe cards (Mono / Poly / Thin-film), each showing look, efficiency, and best use. The 3D lab technology switcher updates the panel texture to match the selected card.</w:t>
+            <w:r/>
+            <w:r>
+              <w:t>Media component plays 04_Three_Technologies.mp4. Narrative component 'The three panel families' provides swipeable cards comparing technologies. Article class 'solar-surface-alt solar-wallpaper-light'.</w:t>
             </w:r>
           </w:p>
         </w:tc>
@@ -846,12 +2082,37 @@
             <w:tcW w:type="dxa" w:w="2160"/>
           </w:tcPr>
           <w:p>
-            <w:r>
-              <w:t>Card 1: Monocrystalline — black, highest efficiency, limited space</w:t>
-              <w:br/>
-              <w:t>Card 2: Polycrystalline — blue, budget-friendly, space available</w:t>
-              <w:br/>
-              <w:t>Card 3: Thin-film — flexible, best in high heat</w:t>
+            <w:r/>
+            <w:r>
+              <w:t>Title: The three technologies</w:t>
+            </w:r>
+          </w:p>
+          <w:p>
+            <w:r>
+              <w:t>There are three families of panel. Each has a different look, efficiency and best use.</w:t>
+            </w:r>
+          </w:p>
+          <w:p>
+            <w:r/>
+          </w:p>
+          <w:p>
+            <w:r>
+              <w:t>Narrative cards:</w:t>
+            </w:r>
+          </w:p>
+          <w:p>
+            <w:r>
+              <w:t>1. Monocrystalline — Cut from a single silicon crystal. Black, the most efficient, and the smallest area per watt — best where roof space is limited.</w:t>
+            </w:r>
+          </w:p>
+          <w:p>
+            <w:r>
+              <w:t>2. Polycrystalline — Cast from many crystals. Blue and speckled, a little less efficient, and the friendliest on price per watt when space is available.</w:t>
+            </w:r>
+          </w:p>
+          <w:p>
+            <w:r>
+              <w:t>3. Thin-film — Deposited semiconductor layers. Uniform and flexible, the lowest efficiency, but the calmest performer in extreme heat.</w:t>
             </w:r>
           </w:p>
         </w:tc>
@@ -862,12 +2123,29 @@
             <w:tcW w:type="dxa" w:w="2160"/>
           </w:tcPr>
           <w:p>
+            <w:r/>
             <w:r>
               <w:t>Scene 5</w:t>
-              <w:br/>
+            </w:r>
+          </w:p>
+          <w:p>
+            <w:r>
               <w:t>Reading Specifications</w:t>
-              <w:br/>
-              <w:t>1:40</w:t>
+            </w:r>
+          </w:p>
+          <w:p>
+            <w:r>
+              <w:t>Article: a-30</w:t>
+            </w:r>
+          </w:p>
+          <w:p>
+            <w:r>
+              <w:t>Blocks: b-30, b-31</w:t>
+            </w:r>
+          </w:p>
+          <w:p>
+            <w:r>
+              <w:t>Components: c-30, c-31</w:t>
             </w:r>
           </w:p>
         </w:tc>
@@ -876,9 +2154,13 @@
             <w:tcW w:type="dxa" w:w="2160"/>
           </w:tcPr>
           <w:p>
-            <w:r>
-              <w:t>Meera (Site Engineer):</w:t>
-              <w:br/>
+            <w:r/>
+            <w:r>
+              <w:t>Site Engineer (Meera):</w:t>
+            </w:r>
+          </w:p>
+          <w:p>
+            <w:r>
               <w:t>Watt-peak is measured at standard test conditions. Voc is the open-circuit voltage, Isc the short-circuit current, and the temperature coefficient shows how much power is lost as the panel heats up.</w:t>
             </w:r>
           </w:p>
@@ -888,8 +2170,9 @@
             <w:tcW w:type="dxa" w:w="2160"/>
           </w:tcPr>
           <w:p>
-            <w:r>
-              <w:t>Media component with video. Below it, the panel labels + spec card interactive: hotspots on the panel image identify each physical part; the spec card shows SolarMax-400W values and a short definition of each term.</w:t>
+            <w:r/>
+            <w:r>
+              <w:t>Media component plays 05_Specifications.mp4. Text component 'What capacity means' explains the spec sheet values under Standard Test Conditions.</w:t>
             </w:r>
           </w:p>
         </w:tc>
@@ -898,20 +2181,27 @@
             <w:tcW w:type="dxa" w:w="2160"/>
           </w:tcPr>
           <w:p>
-            <w:r>
-              <w:t>Spec card:</w:t>
-              <w:br/>
-              <w:t>Pmax 400 Wp</w:t>
-              <w:br/>
-              <w:t>Voc 49.8 V</w:t>
-              <w:br/>
-              <w:t>Isc 10.25 A</w:t>
-              <w:br/>
-              <w:t>Vmp 41.6 V</w:t>
-              <w:br/>
-              <w:t>Imp 9.62 A</w:t>
-              <w:br/>
-              <w:t>Temp coeff -0.35 %/°C</w:t>
+            <w:r/>
+            <w:r>
+              <w:t>Title: Reading specifications</w:t>
+            </w:r>
+          </w:p>
+          <w:p>
+            <w:r>
+              <w:t>Every panel carries a datasheet. The key numbers tell you how it behaves once wired into the system.</w:t>
+            </w:r>
+          </w:p>
+          <w:p>
+            <w:r/>
+          </w:p>
+          <w:p>
+            <w:r>
+              <w:t>Text component:</w:t>
+            </w:r>
+          </w:p>
+          <w:p>
+            <w:r>
+              <w:t>A panel rated 395 watt-peak (Wp) is measured at Standard Test Conditions (1000 W/m², 25 °C). The datasheet's key numbers — Pmax, Voc, Isc, Vmp and Imp, plus efficiency and the temperature coefficient — tell you how the panel behaves once it is wired into the system.</w:t>
             </w:r>
           </w:p>
         </w:tc>
@@ -922,12 +2212,29 @@
             <w:tcW w:type="dxa" w:w="2160"/>
           </w:tcPr>
           <w:p>
+            <w:r/>
             <w:r>
               <w:t>Scene 6</w:t>
-              <w:br/>
-              <w:t>3D Virtual Lab &amp; AR</w:t>
-              <w:br/>
-              <w:t>2:00</w:t>
+            </w:r>
+          </w:p>
+          <w:p>
+            <w:r>
+              <w:t>3D Virtual Lab</w:t>
+            </w:r>
+          </w:p>
+          <w:p>
+            <w:r>
+              <w:t>Article: a-35</w:t>
+            </w:r>
+          </w:p>
+          <w:p>
+            <w:r>
+              <w:t>Block: b-35</w:t>
+            </w:r>
+          </w:p>
+          <w:p>
+            <w:r>
+              <w:t>Component: c-35</w:t>
             </w:r>
           </w:p>
         </w:tc>
@@ -936,9 +2243,13 @@
             <w:tcW w:type="dxa" w:w="2160"/>
           </w:tcPr>
           <w:p>
+            <w:r/>
             <w:r>
               <w:t>Narrator (Arjun):</w:t>
-              <w:br/>
+            </w:r>
+          </w:p>
+          <w:p>
+            <w:r>
               <w:t>In the 3D lab you can rotate the module, explode its layers, switch between the three technologies, and change the sunlight and temperature to watch the live power output respond.</w:t>
             </w:r>
           </w:p>
@@ -948,8 +2259,9 @@
             <w:tcW w:type="dxa" w:w="2160"/>
           </w:tcPr>
           <w:p>
-            <w:r>
-              <w:t>Embedded 3D virtual lab (three.js) and the AR experience (model-viewer). model-viewer loads panel.glb with ios-src=panel.usdz for iOS Quick Look. The Launch AR button calls viewer.activateAR(). Desktop fallback shows QR code to open on a phone.</w:t>
+            <w:r/>
+            <w:r>
+              <w:t>Custom solar-embed component loads course/en/solar-pv-3d-lab/index.html. Learner rotates module, explodes layers, switches Mono/Poly/Thin-film, and adjusts sun/temperature to see live output. Article class 'solar-dark solar-wallpaper-dark'. Launch button opens full-screen lab.</w:t>
             </w:r>
           </w:p>
         </w:tc>
@@ -958,12 +2270,19 @@
             <w:tcW w:type="dxa" w:w="2160"/>
           </w:tcPr>
           <w:p>
-            <w:r>
-              <w:t>Buttons: Launch full-screen lab · Launch AR full-screen</w:t>
-              <w:br/>
-              <w:t>Tip: Move your phone slowly and point at an open floor</w:t>
-              <w:br/>
-              <w:t>AR: View in AR / Auto-track AR / Manual AR</w:t>
+            <w:r/>
+            <w:r>
+              <w:t>Title: Open the 3D virtual lab</w:t>
+            </w:r>
+          </w:p>
+          <w:p>
+            <w:r>
+              <w:t>Rotate the module, explode its layers, switch Mono / Poly / Thin-film, and change sunlight and temperature to watch live power output respond.</w:t>
+            </w:r>
+          </w:p>
+          <w:p>
+            <w:r>
+              <w:t>CTA: Launch full-screen lab</w:t>
             </w:r>
           </w:p>
         </w:tc>
@@ -974,12 +2293,29 @@
             <w:tcW w:type="dxa" w:w="2160"/>
           </w:tcPr>
           <w:p>
+            <w:r/>
             <w:r>
               <w:t>Scene 7</w:t>
-              <w:br/>
-              <w:t>Summary &amp; Assessment</w:t>
-              <w:br/>
-              <w:t>1:00</w:t>
+            </w:r>
+          </w:p>
+          <w:p>
+            <w:r>
+              <w:t>AR Experience</w:t>
+            </w:r>
+          </w:p>
+          <w:p>
+            <w:r>
+              <w:t>Article: a-37</w:t>
+            </w:r>
+          </w:p>
+          <w:p>
+            <w:r>
+              <w:t>Block: b-37</w:t>
+            </w:r>
+          </w:p>
+          <w:p>
+            <w:r>
+              <w:t>Component: c-37</w:t>
             </w:r>
           </w:p>
         </w:tc>
@@ -988,10 +2324,9 @@
             <w:tcW w:type="dxa" w:w="2160"/>
           </w:tcPr>
           <w:p>
-            <w:r>
-              <w:t>Narrator (Arjun):</w:t>
-              <w:br/>
-              <w:t>You can now name the layers of a solar module, read its key specifications, tell the three technologies apart, and choose the right panel for a site. That's the installer's craft.</w:t>
+            <w:r/>
+            <w:r>
+              <w:t>Narrator (Arjun): Now place a full-size panel in your own space. Tap Launch AR, point your phone at the floor, and the panel appears life-size.</w:t>
             </w:r>
           </w:p>
         </w:tc>
@@ -1000,8 +2335,9 @@
             <w:tcW w:type="dxa" w:w="2160"/>
           </w:tcPr>
           <w:p>
-            <w:r>
-              <w:t>Summary video, followed by three assessment components: Q1 MCQ (which layer faces the sun), Q2 MCQ (most power per m²), Q3 matching (Pmax / Voc / Isc). SCORM 1.2 records raw score, interactions, and sets lesson_status to completed on pass.</w:t>
+            <w:r/>
+            <w:r>
+              <w:t>Custom solar-embed loads course/en/ar.html. model-viewer loads panel.glb with ios-src=panel.usdz for iOS Quick Look. Launch button calls activateAR(). Article class 'solar-surface-alt solar-wallpaper-light'. QR code fallback for desktop users.</w:t>
             </w:r>
           </w:p>
         </w:tc>
@@ -1010,12 +2346,24 @@
             <w:tcW w:type="dxa" w:w="2160"/>
           </w:tcPr>
           <w:p>
-            <w:r>
-              <w:t>Q1: Tempered front glass</w:t>
-              <w:br/>
-              <w:t>Q2: Monocrystalline</w:t>
-              <w:br/>
-              <w:t>Q3: Pmax = Maximum power, Voc = Open-circuit voltage, Isc = Short-circuit current</w:t>
+            <w:r/>
+            <w:r>
+              <w:t>Title: View the panel in your space</w:t>
+            </w:r>
+          </w:p>
+          <w:p>
+            <w:r>
+              <w:t>Point your phone camera at a Hiro marker to place a full-size 3D panel in your space.</w:t>
+            </w:r>
+          </w:p>
+          <w:p>
+            <w:r>
+              <w:t>CTA: Launch AR full-screen</w:t>
+            </w:r>
+          </w:p>
+          <w:p>
+            <w:r>
+              <w:t>Fallback: AR works best on a mobile phone over HTTPS. On desktop, scan the QR code with your phone to launch the experience.</w:t>
             </w:r>
           </w:p>
         </w:tc>
@@ -1026,8 +2374,29 @@
             <w:tcW w:type="dxa" w:w="2160"/>
           </w:tcPr>
           <w:p>
-            <w:r>
-              <w:t>Deliverables</w:t>
+            <w:r/>
+            <w:r>
+              <w:t>Scene 8</w:t>
+            </w:r>
+          </w:p>
+          <w:p>
+            <w:r>
+              <w:t>Interactive Component Lab</w:t>
+            </w:r>
+          </w:p>
+          <w:p>
+            <w:r>
+              <w:t>Article: a-39</w:t>
+            </w:r>
+          </w:p>
+          <w:p>
+            <w:r>
+              <w:t>Block: b-39</w:t>
+            </w:r>
+          </w:p>
+          <w:p>
+            <w:r>
+              <w:t>Component: c-39</w:t>
             </w:r>
           </w:p>
         </w:tc>
@@ -1036,8 +2405,9 @@
             <w:tcW w:type="dxa" w:w="2160"/>
           </w:tcPr>
           <w:p>
-            <w:r>
-              <w:t>N/A</w:t>
+            <w:r/>
+            <w:r>
+              <w:t>Narrator (Arjun): Apply what you have learned across four hands-on tools.</w:t>
             </w:r>
           </w:p>
         </w:tc>
@@ -1046,8 +2416,9 @@
             <w:tcW w:type="dxa" w:w="2160"/>
           </w:tcPr>
           <w:p>
-            <w:r>
-              <w:t>Build command: NODE_OPTIONS=--experimental-global-webcrypto npx grunt build --disable-cache. Package includes imsmanifest.xml pointing to index_lms.html, pipwerks SCORM API wrapper, all videos, interactives, 3D assets, and the fixed AR page.</w:t>
+            <w:r/>
+            <w:r>
+              <w:t>Custom solar-embed loads course/en/interactives.html. Contains: build the module, size a system, explore temperature effects, choose the right panel for a site. Article class 'solar-surface solar-wallpaper-light'.</w:t>
             </w:r>
           </w:p>
         </w:tc>
@@ -1056,11 +2427,560 @@
             <w:tcW w:type="dxa" w:w="2160"/>
           </w:tcPr>
           <w:p>
-            <w:r>
-              <w:t>Solar_PV_Adapt_SCORM12.zip</w:t>
-              <w:br/>
+            <w:r/>
+            <w:r>
+              <w:t>Title: Interactive component lab</w:t>
+            </w:r>
+          </w:p>
+          <w:p>
+            <w:r>
+              <w:t>Four hands-on tools: build the module, size a system, explore temperature effects, and choose the right panel for a site.</w:t>
+            </w:r>
+          </w:p>
+          <w:p>
+            <w:r>
+              <w:t>CTA: Launch full-screen tools</w:t>
+            </w:r>
+          </w:p>
+        </w:tc>
+      </w:tr>
+      <w:tr>
+        <w:tc>
+          <w:tcPr>
+            <w:tcW w:type="dxa" w:w="2160"/>
+          </w:tcPr>
+          <w:p>
+            <w:r/>
+            <w:r>
+              <w:t>Scene 9</w:t>
+            </w:r>
+          </w:p>
+          <w:p>
+            <w:r>
+              <w:t>System Energy Flow</w:t>
+            </w:r>
+          </w:p>
+          <w:p>
+            <w:r>
+              <w:t>Article: a-70</w:t>
+            </w:r>
+          </w:p>
+          <w:p>
+            <w:r>
+              <w:t>Block: b-70</w:t>
+            </w:r>
+          </w:p>
+          <w:p>
+            <w:r>
+              <w:t>Component: c-70</w:t>
+            </w:r>
+          </w:p>
+        </w:tc>
+        <w:tc>
+          <w:tcPr>
+            <w:tcW w:type="dxa" w:w="2160"/>
+          </w:tcPr>
+          <w:p>
+            <w:r/>
+            <w:r>
+              <w:t>Narrator (Arjun): Click each part of the rooftop system to learn its role, then switch between day and night to see how energy flows from panels to battery to household loads.</w:t>
+            </w:r>
+          </w:p>
+        </w:tc>
+        <w:tc>
+          <w:tcPr>
+            <w:tcW w:type="dxa" w:w="2160"/>
+          </w:tcPr>
+          <w:p>
+            <w:r/>
+            <w:r>
+              <w:t>Custom solar-embed loads course/en/interactive-system-diagram.html. SVG-based interactive diagram with clickable rooftop components and day/night energy-flow toggle.</w:t>
+            </w:r>
+          </w:p>
+        </w:tc>
+        <w:tc>
+          <w:tcPr>
+            <w:tcW w:type="dxa" w:w="2160"/>
+          </w:tcPr>
+          <w:p>
+            <w:r/>
+            <w:r>
+              <w:t>Title: System energy flow</w:t>
+            </w:r>
+          </w:p>
+          <w:p>
+            <w:r>
+              <w:t>Click each part of the rooftop system to learn its role, then switch between day and night to see how energy flows from panels to battery to household loads.</w:t>
+            </w:r>
+          </w:p>
+          <w:p>
+            <w:r>
+              <w:t>CTA: Launch full-screen diagram</w:t>
+            </w:r>
+          </w:p>
+        </w:tc>
+      </w:tr>
+      <w:tr>
+        <w:tc>
+          <w:tcPr>
+            <w:tcW w:type="dxa" w:w="2160"/>
+          </w:tcPr>
+          <w:p>
+            <w:r/>
+            <w:r>
+              <w:t>Scene 10</w:t>
+            </w:r>
+          </w:p>
+          <w:p>
+            <w:r>
+              <w:t>Panel Parts and Specifications</w:t>
+            </w:r>
+          </w:p>
+          <w:p>
+            <w:r>
+              <w:t>Article: a-72</w:t>
+            </w:r>
+          </w:p>
+          <w:p>
+            <w:r>
+              <w:t>Block: b-72</w:t>
+            </w:r>
+          </w:p>
+          <w:p>
+            <w:r>
+              <w:t>Component: c-72</w:t>
+            </w:r>
+          </w:p>
+        </w:tc>
+        <w:tc>
+          <w:tcPr>
+            <w:tcW w:type="dxa" w:w="2160"/>
+          </w:tcPr>
+          <w:p>
+            <w:r/>
+            <w:r>
+              <w:t>Site Engineer (Meera): Tap each hotspot on the panel to identify the layer and see how the SolarMax-400W specification relates to real-world performance.</w:t>
+            </w:r>
+          </w:p>
+        </w:tc>
+        <w:tc>
+          <w:tcPr>
+            <w:tcW w:type="dxa" w:w="2160"/>
+          </w:tcPr>
+          <w:p>
+            <w:r/>
+            <w:r>
+              <w:t>Custom solar-embed loads course/en/interactive-panel-labels.html. Cinematic zoom-in labels with clickable hotspots over the panel image.</w:t>
+            </w:r>
+          </w:p>
+        </w:tc>
+        <w:tc>
+          <w:tcPr>
+            <w:tcW w:type="dxa" w:w="2160"/>
+          </w:tcPr>
+          <w:p>
+            <w:r/>
+            <w:r>
+              <w:t>Title: Panel parts and specifications</w:t>
+            </w:r>
+          </w:p>
+          <w:p>
+            <w:r>
+              <w:t>Tap each hotspot on the panel to identify the layer and see how the SolarMax-400W specification relates to real-world performance.</w:t>
+            </w:r>
+          </w:p>
+          <w:p>
+            <w:r>
+              <w:t>CTA: Launch full-screen panel card</w:t>
+            </w:r>
+          </w:p>
+        </w:tc>
+      </w:tr>
+      <w:tr>
+        <w:tc>
+          <w:tcPr>
+            <w:tcW w:type="dxa" w:w="2160"/>
+          </w:tcPr>
+          <w:p>
+            <w:r/>
+            <w:r>
+              <w:t>Scene 11</w:t>
+            </w:r>
+          </w:p>
+          <w:p>
+            <w:r>
+              <w:t>P-N Junction Simulation</w:t>
+            </w:r>
+          </w:p>
+          <w:p>
+            <w:r>
+              <w:t>Article: a-73</w:t>
+            </w:r>
+          </w:p>
+          <w:p>
+            <w:r>
+              <w:t>Block: b-73</w:t>
+            </w:r>
+          </w:p>
+          <w:p>
+            <w:r>
+              <w:t>Component: c-73</w:t>
+            </w:r>
+          </w:p>
+        </w:tc>
+        <w:tc>
+          <w:tcPr>
+            <w:tcW w:type="dxa" w:w="2160"/>
+          </w:tcPr>
+          <w:p>
+            <w:r/>
+            <w:r>
+              <w:t>Lab Technician (Divya): Fire a photon into the silicon junction and watch the electric field separate the electron-hole pair to produce DC current.</w:t>
+            </w:r>
+          </w:p>
+        </w:tc>
+        <w:tc>
+          <w:tcPr>
+            <w:tcW w:type="dxa" w:w="2160"/>
+          </w:tcPr>
+          <w:p>
+            <w:r/>
+            <w:r>
+              <w:t>Custom solar-embed loads course/en/interactive-pn-junction.html. Micro zoom charge simulation using SVG/Canvas animation.</w:t>
+            </w:r>
+          </w:p>
+        </w:tc>
+        <w:tc>
+          <w:tcPr>
+            <w:tcW w:type="dxa" w:w="2160"/>
+          </w:tcPr>
+          <w:p>
+            <w:r/>
+            <w:r>
+              <w:t>Title: P-N junction simulation</w:t>
+            </w:r>
+          </w:p>
+          <w:p>
+            <w:r>
+              <w:t>Fire a photon into the silicon junction and watch the electric field separate the electron-hole pair to produce DC current.</w:t>
+            </w:r>
+          </w:p>
+          <w:p>
+            <w:r>
+              <w:t>CTA: Launch full-screen simulation</w:t>
+            </w:r>
+          </w:p>
+        </w:tc>
+      </w:tr>
+      <w:tr>
+        <w:tc>
+          <w:tcPr>
+            <w:tcW w:type="dxa" w:w="2160"/>
+          </w:tcPr>
+          <w:p>
+            <w:r/>
+            <w:r>
+              <w:t>Scene 12</w:t>
+            </w:r>
+          </w:p>
+          <w:p>
+            <w:r>
+              <w:t>Electrical Safety Lab</w:t>
+            </w:r>
+          </w:p>
+          <w:p>
+            <w:r>
+              <w:t>Article: a-45</w:t>
+            </w:r>
+          </w:p>
+          <w:p>
+            <w:r>
+              <w:t>Block: b-45</w:t>
+            </w:r>
+          </w:p>
+          <w:p>
+            <w:r>
+              <w:t>Component: c-45</w:t>
+            </w:r>
+          </w:p>
+        </w:tc>
+        <w:tc>
+          <w:tcPr>
+            <w:tcW w:type="dxa" w:w="2160"/>
+          </w:tcPr>
+          <w:p>
+            <w:r/>
+            <w:r>
+              <w:t>Site Engineer (Meera): Before working on live PV circuits, installers must lock out energy and wear the right PPE. Complete the three safety simulations.</w:t>
+            </w:r>
+          </w:p>
+        </w:tc>
+        <w:tc>
+          <w:tcPr>
+            <w:tcW w:type="dxa" w:w="2160"/>
+          </w:tcPr>
+          <w:p>
+            <w:r/>
+            <w:r>
+              <w:t>Custom solar-embed loads course/en/safety-lab.html. Three simulations: choose right PPE, order lockout/tagout steps, select correct multimeter category rating.</w:t>
+            </w:r>
+          </w:p>
+        </w:tc>
+        <w:tc>
+          <w:tcPr>
+            <w:tcW w:type="dxa" w:w="2160"/>
+          </w:tcPr>
+          <w:p>
+            <w:r/>
+            <w:r>
+              <w:t>Title: Electrical safety lab</w:t>
+            </w:r>
+          </w:p>
+          <w:p>
+            <w:r>
+              <w:t>Three quick simulations: choose the right PPE, order the lockout/tagout steps, and select the correct multimeter category rating before touching a DC circuit.</w:t>
+            </w:r>
+          </w:p>
+          <w:p>
+            <w:r>
+              <w:t>CTA: Launch full-screen safety lab</w:t>
+            </w:r>
+          </w:p>
+        </w:tc>
+      </w:tr>
+      <w:tr>
+        <w:tc>
+          <w:tcPr>
+            <w:tcW w:type="dxa" w:w="2160"/>
+          </w:tcPr>
+          <w:p>
+            <w:r/>
+            <w:r>
+              <w:t>Scene 13</w:t>
+            </w:r>
+          </w:p>
+          <w:p>
+            <w:r>
+              <w:t>Knowledge Check</w:t>
+            </w:r>
+          </w:p>
+          <w:p>
+            <w:r>
+              <w:t>Article: a-50</w:t>
+            </w:r>
+          </w:p>
+          <w:p>
+            <w:r>
+              <w:t>Block: b-50</w:t>
+            </w:r>
+          </w:p>
+          <w:p>
+            <w:r>
+              <w:t>Components: c-50 (MCQ), c-51 (MCQ), c-52 (Matching)</w:t>
+            </w:r>
+          </w:p>
+        </w:tc>
+        <w:tc>
+          <w:tcPr>
+            <w:tcW w:type="dxa" w:w="2160"/>
+          </w:tcPr>
+          <w:p>
+            <w:r/>
+            <w:r>
+              <w:t>Narrator (Arjun): Let us check what you remember. Three quick questions.</w:t>
+            </w:r>
+          </w:p>
+        </w:tc>
+        <w:tc>
+          <w:tcPr>
+            <w:tcW w:type="dxa" w:w="2160"/>
+          </w:tcPr>
+          <w:p>
+            <w:r/>
+            <w:r>
+              <w:t>Assessment article 'Knowledge check' enabled with _assessment: scoreToPass=60%, attempts=2, percentageBased=True. Q1/Q2 are MCQ components; Q3 is a matching component. All record interactions and contribute to the total score.</w:t>
+            </w:r>
+          </w:p>
+        </w:tc>
+        <w:tc>
+          <w:tcPr>
+            <w:tcW w:type="dxa" w:w="2160"/>
+          </w:tcPr>
+          <w:p>
+            <w:r/>
+            <w:r>
+              <w:t>Q1: Which layer of a solar PV module faces the sun and protects the cells? — Answer: Tempered front glass</w:t>
+            </w:r>
+          </w:p>
+          <w:p>
+            <w:r>
+              <w:t>Q2: Which technology produces the most power per square metre? — Answer: Monocrystalline</w:t>
+            </w:r>
+          </w:p>
+          <w:p>
+            <w:r>
+              <w:t xml:space="preserve">Q3: Match each specification to its meaning. — Matching: Pmax =  | Voc =  | Isc = </w:t>
+            </w:r>
+          </w:p>
+        </w:tc>
+      </w:tr>
+      <w:tr>
+        <w:tc>
+          <w:tcPr>
+            <w:tcW w:type="dxa" w:w="2160"/>
+          </w:tcPr>
+          <w:p>
+            <w:r/>
+            <w:r>
+              <w:t>Scene 14</w:t>
+            </w:r>
+          </w:p>
+          <w:p>
+            <w:r>
+              <w:t>Summary</w:t>
+            </w:r>
+          </w:p>
+          <w:p>
+            <w:r>
+              <w:t>Article: a-60</w:t>
+            </w:r>
+          </w:p>
+          <w:p>
+            <w:r>
+              <w:t>Block: b-60</w:t>
+            </w:r>
+          </w:p>
+          <w:p>
+            <w:r>
+              <w:t>Component: c-60</w:t>
+            </w:r>
+          </w:p>
+        </w:tc>
+        <w:tc>
+          <w:tcPr>
+            <w:tcW w:type="dxa" w:w="2160"/>
+          </w:tcPr>
+          <w:p>
+            <w:r/>
+            <w:r>
+              <w:t>Narrator (Arjun):</w:t>
+            </w:r>
+          </w:p>
+          <w:p>
+            <w:r>
+              <w:t>You can now name the layers of a solar module, read its key specifications, tell the three technologies apart, and choose the right panel for a site. That's the installer's craft.</w:t>
+            </w:r>
+          </w:p>
+        </w:tc>
+        <w:tc>
+          <w:tcPr>
+            <w:tcW w:type="dxa" w:w="2160"/>
+          </w:tcPr>
+          <w:p>
+            <w:r/>
+            <w:r>
+              <w:t>Media component plays 07_Summary.mp4 with VTT captions. Article class 'solar-dark solar-wallpaper-dark' uses dark solar wallpaper. Completion set on play.</w:t>
+            </w:r>
+          </w:p>
+        </w:tc>
+        <w:tc>
+          <w:tcPr>
+            <w:tcW w:type="dxa" w:w="2160"/>
+          </w:tcPr>
+          <w:p>
+            <w:r/>
+            <w:r>
+              <w:t>Title: Summary</w:t>
+            </w:r>
+          </w:p>
+          <w:p>
+            <w:r>
+              <w:t>Key takeaways from this module.</w:t>
+            </w:r>
+          </w:p>
+          <w:p>
+            <w:r>
+              <w:t>Instruction: Press play for the summary.</w:t>
+            </w:r>
+          </w:p>
+        </w:tc>
+      </w:tr>
+      <w:tr>
+        <w:tc>
+          <w:tcPr>
+            <w:tcW w:type="dxa" w:w="2160"/>
+          </w:tcPr>
+          <w:p>
+            <w:r/>
+            <w:r>
+              <w:t>Deliverables</w:t>
+            </w:r>
+          </w:p>
+          <w:p>
+            <w:r>
+              <w:t>Package Details</w:t>
+            </w:r>
+          </w:p>
+        </w:tc>
+        <w:tc>
+          <w:tcPr>
+            <w:tcW w:type="dxa" w:w="2160"/>
+          </w:tcPr>
+          <w:p>
+            <w:r/>
+            <w:r>
+              <w:t>N/A</w:t>
+            </w:r>
+          </w:p>
+        </w:tc>
+        <w:tc>
+          <w:tcPr>
+            <w:tcW w:type="dxa" w:w="2160"/>
+          </w:tcPr>
+          <w:p>
+            <w:r/>
+            <w:r>
+              <w:t>Build command: NODE_OPTIONS=--experimental-global-webcrypto npx grunt build --disable-cache. Output includes imsmanifest.xml (SCORM 1.2), index_lms.html, SCORM_API_wrapper.js, all videos, interactives, 3D assets (panel.glb, panel.usdz), and custom components.</w:t>
+            </w:r>
+          </w:p>
+        </w:tc>
+        <w:tc>
+          <w:tcPr>
+            <w:tcW w:type="dxa" w:w="2160"/>
+          </w:tcPr>
+          <w:p>
+            <w:r/>
+            <w:r>
+              <w:t>Files delivered:</w:t>
+            </w:r>
+          </w:p>
+          <w:p>
+            <w:r>
+              <w:t>- Solar_PV_Adapt_SCORM12.zip (SCORM 1.2 package, ~11 MB)</w:t>
+            </w:r>
+          </w:p>
+          <w:p>
+            <w:r>
+              <w:t>- Technology_Stack.md</w:t>
+            </w:r>
+          </w:p>
+          <w:p>
+            <w:r>
+              <w:t>- How_to_Run_SCORM_Internally.md</w:t>
+            </w:r>
+          </w:p>
+          <w:p>
+            <w:r>
+              <w:t>- SolarPV_Unit2_Storyboard.docx</w:t>
+            </w:r>
+          </w:p>
+          <w:p>
+            <w:r>
               <w:t>Live preview: https://nikhilsaini-iitj.github.io/Solar_PV_Adapt_SCORM12/</w:t>
-              <w:br/>
+            </w:r>
+          </w:p>
+          <w:p>
+            <w:r>
               <w:t>Repo: https://github.com/nikhilsaini-iitj/Solar_PV_Adapt_SCORM12</w:t>
             </w:r>
           </w:p>
@@ -1076,7 +2996,7 @@
           <w:color w:val="7D95B0"/>
           <w:sz w:val="20"/>
         </w:rPr>
-        <w:t>Solar PV Unit 2 — Storyboard &amp; Delivery Pack · 25 June 2026</w:t>
+        <w:t>Solar PV — Unit 2 Storyboard · Generated from live SCORM package · Solar PV — Unit 2</w:t>
       </w:r>
     </w:p>
     <w:sectPr>

</xml_diff>